<commit_message>
Sua loi url localhost tren production
</commit_message>
<xml_diff>
--- a/baocao/BaoCaoDoAn2_LeQuangHuy_223571.docx
+++ b/baocao/BaoCaoDoAn2_LeQuangHuy_223571.docx
@@ -2363,7 +2363,23 @@
           <w:szCs w:val="26"/>
           <w:lang w:val="vi-VN"/>
         </w:rPr>
-        <w:t>hoa Công Nghệ Thông Tin, cùng các giảng viên đã tận tình chỉ dạy và tạo điều kiện giúp đỡ em trong quá trình học tập, nghiên cứu và hoàn thành đề tài.</w:t>
+        <w:t xml:space="preserve">hoa Công Nghệ Thông Tin, cùng các giảng viên đã tận tình chỉ dạy và tạo điều kiện giúp đỡ em trong quá trình học tập, nghiên cứu và hoàn thành </w:t>
+      </w:r>
+      <w:r>
+        <w:rPr>
+          <w:rFonts w:cs="Times New Roman"/>
+          <w:szCs w:val="26"/>
+          <w:lang w:val="vi-VN"/>
+        </w:rPr>
+        <w:t>đồ án</w:t>
+      </w:r>
+      <w:r>
+        <w:rPr>
+          <w:rFonts w:cs="Times New Roman"/>
+          <w:szCs w:val="26"/>
+          <w:lang w:val="vi-VN"/>
+        </w:rPr>
+        <w:t>.</w:t>
       </w:r>
     </w:p>
     <w:p>
@@ -2407,7 +2423,39 @@
           <w:szCs w:val="26"/>
           <w:lang w:val="vi-VN"/>
         </w:rPr>
-        <w:t>– người hướng dẫn và cũng là người đã luôn tận tình chỉ bảo, giúp đỡ và động viên em trong suốt quá trình nghiên cứu và hoàn thành đề tài thực tập nghiên cứu này.</w:t>
+        <w:t xml:space="preserve">– người hướng dẫn và cũng là người đã luôn tận tình chỉ bảo, giúp đỡ và động viên em trong suốt quá trình nghiên cứu và hoàn thành </w:t>
+      </w:r>
+      <w:r>
+        <w:rPr>
+          <w:rFonts w:cs="Times New Roman"/>
+          <w:szCs w:val="26"/>
+          <w:lang w:val="vi-VN"/>
+        </w:rPr>
+        <w:t>đồ án</w:t>
+      </w:r>
+      <w:r>
+        <w:rPr>
+          <w:rFonts w:cs="Times New Roman"/>
+          <w:szCs w:val="26"/>
+          <w:lang w:val="vi-VN"/>
+        </w:rPr>
+        <w:t xml:space="preserve"> chuyên ngành</w:t>
+      </w:r>
+      <w:r>
+        <w:rPr>
+          <w:rFonts w:cs="Times New Roman"/>
+          <w:szCs w:val="26"/>
+          <w:lang w:val="vi-VN"/>
+        </w:rPr>
+        <w:t xml:space="preserve"> 2 </w:t>
+      </w:r>
+      <w:r>
+        <w:rPr>
+          <w:rFonts w:cs="Times New Roman"/>
+          <w:szCs w:val="26"/>
+          <w:lang w:val="vi-VN"/>
+        </w:rPr>
+        <w:t>này.</w:t>
       </w:r>
     </w:p>
     <w:p>
@@ -2427,7 +2475,23 @@
           <w:szCs w:val="26"/>
           <w:lang w:val="vi-VN"/>
         </w:rPr>
-        <w:t>Mặc dù, đã cố gắng rất nhiều nhưng bài luận không tránh khỏi những thiếu sót; em rất mong nhận được sự thông cảm, chỉ dẫn, giúp đỡ và đóng góp ý kiến của quý thầy cô, các cán bộ quản lý và các bạn đang học cùng em tại Trường Đại học Nam Cần Thơ</w:t>
+        <w:t xml:space="preserve">Mặc dù, đã cố gắng rất nhiều nhưng bài </w:t>
+      </w:r>
+      <w:r>
+        <w:rPr>
+          <w:rFonts w:cs="Times New Roman"/>
+          <w:szCs w:val="26"/>
+          <w:lang w:val="vi-VN"/>
+        </w:rPr>
+        <w:t>báo cáo</w:t>
+      </w:r>
+      <w:r>
+        <w:rPr>
+          <w:rFonts w:cs="Times New Roman"/>
+          <w:szCs w:val="26"/>
+          <w:lang w:val="vi-VN"/>
+        </w:rPr>
+        <w:t xml:space="preserve"> không tránh khỏi những thiếu sót; em rất mong nhận được sự thông cảm, chỉ dẫn, giúp đỡ và đóng góp ý kiến của quý thầy cô, các cán bộ quản lý và các bạn đang học cùng em tại Trường Đại học Nam Cần Thơ</w:t>
       </w:r>
       <w:r>
         <w:rPr>
@@ -20900,27 +20964,14 @@
       <w:r>
         <w:t>Bảng 2.</w:t>
       </w:r>
-      <w:r>
-        <w:fldChar w:fldCharType="begin"/>
-      </w:r>
-      <w:r>
-        <w:instrText xml:space="preserve"> SEQ Bảng_2. \* ARABIC </w:instrText>
-      </w:r>
-      <w:r>
-        <w:fldChar w:fldCharType="separate"/>
-      </w:r>
-      <w:r>
-        <w:rPr>
-          <w:noProof/>
-        </w:rPr>
-        <w:t>1</w:t>
-      </w:r>
-      <w:r>
-        <w:rPr>
-          <w:noProof/>
-        </w:rPr>
-        <w:fldChar w:fldCharType="end"/>
-      </w:r>
+      <w:fldSimple w:instr=" SEQ Bảng_2. \* ARABIC ">
+        <w:r>
+          <w:rPr>
+            <w:noProof/>
+          </w:rPr>
+          <w:t>1</w:t>
+        </w:r>
+      </w:fldSimple>
       <w:r>
         <w:rPr>
           <w:lang w:val="vi-VN"/>
@@ -21421,27 +21472,14 @@
       <w:r>
         <w:t>Bảng 2.</w:t>
       </w:r>
-      <w:r>
-        <w:fldChar w:fldCharType="begin"/>
-      </w:r>
-      <w:r>
-        <w:instrText xml:space="preserve"> SEQ Bảng_2. \* ARABIC </w:instrText>
-      </w:r>
-      <w:r>
-        <w:fldChar w:fldCharType="separate"/>
-      </w:r>
-      <w:r>
-        <w:rPr>
-          <w:noProof/>
-        </w:rPr>
-        <w:t>2</w:t>
-      </w:r>
-      <w:r>
-        <w:rPr>
-          <w:noProof/>
-        </w:rPr>
-        <w:fldChar w:fldCharType="end"/>
-      </w:r>
+      <w:fldSimple w:instr=" SEQ Bảng_2. \* ARABIC ">
+        <w:r>
+          <w:rPr>
+            <w:noProof/>
+          </w:rPr>
+          <w:t>2</w:t>
+        </w:r>
+      </w:fldSimple>
       <w:r>
         <w:rPr>
           <w:lang w:val="vi-VN"/>
@@ -24061,27 +24099,14 @@
       <w:r>
         <w:t>Bảng 2.</w:t>
       </w:r>
-      <w:r>
-        <w:fldChar w:fldCharType="begin"/>
-      </w:r>
-      <w:r>
-        <w:instrText xml:space="preserve"> SEQ Bảng_2. \* ARABIC </w:instrText>
-      </w:r>
-      <w:r>
-        <w:fldChar w:fldCharType="separate"/>
-      </w:r>
-      <w:r>
-        <w:rPr>
-          <w:noProof/>
-        </w:rPr>
-        <w:t>3</w:t>
-      </w:r>
-      <w:r>
-        <w:rPr>
-          <w:noProof/>
-        </w:rPr>
-        <w:fldChar w:fldCharType="end"/>
-      </w:r>
+      <w:fldSimple w:instr=" SEQ Bảng_2. \* ARABIC ">
+        <w:r>
+          <w:rPr>
+            <w:noProof/>
+          </w:rPr>
+          <w:t>3</w:t>
+        </w:r>
+      </w:fldSimple>
       <w:r>
         <w:rPr>
           <w:lang w:val="vi-VN"/>
@@ -27350,27 +27375,14 @@
       <w:r>
         <w:t>Bảng 2.</w:t>
       </w:r>
-      <w:r>
-        <w:fldChar w:fldCharType="begin"/>
-      </w:r>
-      <w:r>
-        <w:instrText xml:space="preserve"> SEQ Bảng_2. \* ARABIC </w:instrText>
-      </w:r>
-      <w:r>
-        <w:fldChar w:fldCharType="separate"/>
-      </w:r>
-      <w:r>
-        <w:rPr>
-          <w:noProof/>
-        </w:rPr>
-        <w:t>4</w:t>
-      </w:r>
-      <w:r>
-        <w:rPr>
-          <w:noProof/>
-        </w:rPr>
-        <w:fldChar w:fldCharType="end"/>
-      </w:r>
+      <w:fldSimple w:instr=" SEQ Bảng_2. \* ARABIC ">
+        <w:r>
+          <w:rPr>
+            <w:noProof/>
+          </w:rPr>
+          <w:t>4</w:t>
+        </w:r>
+      </w:fldSimple>
       <w:r>
         <w:rPr>
           <w:lang w:val="vi-VN"/>
@@ -27686,27 +27698,14 @@
       <w:r>
         <w:t>Bảng 2.</w:t>
       </w:r>
-      <w:r>
-        <w:fldChar w:fldCharType="begin"/>
-      </w:r>
-      <w:r>
-        <w:instrText xml:space="preserve"> SEQ Bảng_2. \* ARABIC </w:instrText>
-      </w:r>
-      <w:r>
-        <w:fldChar w:fldCharType="separate"/>
-      </w:r>
-      <w:r>
-        <w:rPr>
-          <w:noProof/>
-        </w:rPr>
-        <w:t>5</w:t>
-      </w:r>
-      <w:r>
-        <w:rPr>
-          <w:noProof/>
-        </w:rPr>
-        <w:fldChar w:fldCharType="end"/>
-      </w:r>
+      <w:fldSimple w:instr=" SEQ Bảng_2. \* ARABIC ">
+        <w:r>
+          <w:rPr>
+            <w:noProof/>
+          </w:rPr>
+          <w:t>5</w:t>
+        </w:r>
+      </w:fldSimple>
       <w:r>
         <w:rPr>
           <w:lang w:val="vi-VN"/>
@@ -31041,27 +31040,14 @@
       <w:r>
         <w:t>Bảng 3.</w:t>
       </w:r>
-      <w:r>
-        <w:fldChar w:fldCharType="begin"/>
-      </w:r>
-      <w:r>
-        <w:instrText xml:space="preserve"> SEQ Bảng_3. \* ARABIC </w:instrText>
-      </w:r>
-      <w:r>
-        <w:fldChar w:fldCharType="separate"/>
-      </w:r>
-      <w:r>
-        <w:rPr>
-          <w:noProof/>
-        </w:rPr>
-        <w:t>1</w:t>
-      </w:r>
-      <w:r>
-        <w:rPr>
-          <w:noProof/>
-        </w:rPr>
-        <w:fldChar w:fldCharType="end"/>
-      </w:r>
+      <w:fldSimple w:instr=" SEQ Bảng_3. \* ARABIC ">
+        <w:r>
+          <w:rPr>
+            <w:noProof/>
+          </w:rPr>
+          <w:t>1</w:t>
+        </w:r>
+      </w:fldSimple>
       <w:r>
         <w:rPr>
           <w:lang w:val="vi-VN"/>
@@ -31257,27 +31243,14 @@
       <w:r>
         <w:t>.</w:t>
       </w:r>
-      <w:r>
-        <w:fldChar w:fldCharType="begin"/>
-      </w:r>
-      <w:r>
-        <w:instrText xml:space="preserve"> SEQ Bảng_3. \* ARABIC </w:instrText>
-      </w:r>
-      <w:r>
-        <w:fldChar w:fldCharType="separate"/>
-      </w:r>
-      <w:r>
-        <w:rPr>
-          <w:noProof/>
-        </w:rPr>
-        <w:t>2</w:t>
-      </w:r>
-      <w:r>
-        <w:rPr>
-          <w:noProof/>
-        </w:rPr>
-        <w:fldChar w:fldCharType="end"/>
-      </w:r>
+      <w:fldSimple w:instr=" SEQ Bảng_3. \* ARABIC ">
+        <w:r>
+          <w:rPr>
+            <w:noProof/>
+          </w:rPr>
+          <w:t>2</w:t>
+        </w:r>
+      </w:fldSimple>
       <w:r>
         <w:rPr>
           <w:lang w:val="vi-VN"/>
@@ -31460,27 +31433,14 @@
       <w:r>
         <w:t>.</w:t>
       </w:r>
-      <w:r>
-        <w:fldChar w:fldCharType="begin"/>
-      </w:r>
-      <w:r>
-        <w:instrText xml:space="preserve"> SEQ Bảng_3. \* ARABIC </w:instrText>
-      </w:r>
-      <w:r>
-        <w:fldChar w:fldCharType="separate"/>
-      </w:r>
-      <w:r>
-        <w:rPr>
-          <w:noProof/>
-        </w:rPr>
-        <w:t>3</w:t>
-      </w:r>
-      <w:r>
-        <w:rPr>
-          <w:noProof/>
-        </w:rPr>
-        <w:fldChar w:fldCharType="end"/>
-      </w:r>
+      <w:fldSimple w:instr=" SEQ Bảng_3. \* ARABIC ">
+        <w:r>
+          <w:rPr>
+            <w:noProof/>
+          </w:rPr>
+          <w:t>3</w:t>
+        </w:r>
+      </w:fldSimple>
       <w:r>
         <w:rPr>
           <w:lang w:val="vi-VN"/>
@@ -32339,27 +32299,14 @@
       <w:r>
         <w:t>.</w:t>
       </w:r>
-      <w:r>
-        <w:fldChar w:fldCharType="begin"/>
-      </w:r>
-      <w:r>
-        <w:instrText xml:space="preserve"> SEQ Bảng_3. \* ARABIC </w:instrText>
-      </w:r>
-      <w:r>
-        <w:fldChar w:fldCharType="separate"/>
-      </w:r>
-      <w:r>
-        <w:rPr>
-          <w:noProof/>
-        </w:rPr>
-        <w:t>4</w:t>
-      </w:r>
-      <w:r>
-        <w:rPr>
-          <w:noProof/>
-        </w:rPr>
-        <w:fldChar w:fldCharType="end"/>
-      </w:r>
+      <w:fldSimple w:instr=" SEQ Bảng_3. \* ARABIC ">
+        <w:r>
+          <w:rPr>
+            <w:noProof/>
+          </w:rPr>
+          <w:t>4</w:t>
+        </w:r>
+      </w:fldSimple>
       <w:r>
         <w:rPr>
           <w:lang w:val="vi-VN"/>
@@ -32647,27 +32594,14 @@
       <w:r>
         <w:t>.</w:t>
       </w:r>
-      <w:r>
-        <w:fldChar w:fldCharType="begin"/>
-      </w:r>
-      <w:r>
-        <w:instrText xml:space="preserve"> SEQ Hình_4. \* ARABIC </w:instrText>
-      </w:r>
-      <w:r>
-        <w:fldChar w:fldCharType="separate"/>
-      </w:r>
-      <w:r>
-        <w:rPr>
-          <w:noProof/>
-        </w:rPr>
-        <w:t>1</w:t>
-      </w:r>
-      <w:r>
-        <w:rPr>
-          <w:noProof/>
-        </w:rPr>
-        <w:fldChar w:fldCharType="end"/>
-      </w:r>
+      <w:fldSimple w:instr=" SEQ Hình_4. \* ARABIC ">
+        <w:r>
+          <w:rPr>
+            <w:noProof/>
+          </w:rPr>
+          <w:t>1</w:t>
+        </w:r>
+      </w:fldSimple>
       <w:r>
         <w:rPr>
           <w:lang w:val="vi-VN"/>
@@ -32777,27 +32711,14 @@
       <w:r>
         <w:t>.</w:t>
       </w:r>
-      <w:r>
-        <w:fldChar w:fldCharType="begin"/>
-      </w:r>
-      <w:r>
-        <w:instrText xml:space="preserve"> SEQ Hình_4. \* ARABIC </w:instrText>
-      </w:r>
-      <w:r>
-        <w:fldChar w:fldCharType="separate"/>
-      </w:r>
-      <w:r>
-        <w:rPr>
-          <w:noProof/>
-        </w:rPr>
-        <w:t>2</w:t>
-      </w:r>
-      <w:r>
-        <w:rPr>
-          <w:noProof/>
-        </w:rPr>
-        <w:fldChar w:fldCharType="end"/>
-      </w:r>
+      <w:fldSimple w:instr=" SEQ Hình_4. \* ARABIC ">
+        <w:r>
+          <w:rPr>
+            <w:noProof/>
+          </w:rPr>
+          <w:t>2</w:t>
+        </w:r>
+      </w:fldSimple>
       <w:r>
         <w:rPr>
           <w:lang w:val="vi-VN"/>
@@ -32940,27 +32861,14 @@
       <w:r>
         <w:t>.</w:t>
       </w:r>
-      <w:r>
-        <w:fldChar w:fldCharType="begin"/>
-      </w:r>
-      <w:r>
-        <w:instrText xml:space="preserve"> SEQ Hình_4. \* ARABIC </w:instrText>
-      </w:r>
-      <w:r>
-        <w:fldChar w:fldCharType="separate"/>
-      </w:r>
-      <w:r>
-        <w:rPr>
-          <w:noProof/>
-        </w:rPr>
-        <w:t>3</w:t>
-      </w:r>
-      <w:r>
-        <w:rPr>
-          <w:noProof/>
-        </w:rPr>
-        <w:fldChar w:fldCharType="end"/>
-      </w:r>
+      <w:fldSimple w:instr=" SEQ Hình_4. \* ARABIC ">
+        <w:r>
+          <w:rPr>
+            <w:noProof/>
+          </w:rPr>
+          <w:t>3</w:t>
+        </w:r>
+      </w:fldSimple>
       <w:r>
         <w:rPr>
           <w:lang w:val="vi-VN"/>
@@ -33077,27 +32985,14 @@
       <w:r>
         <w:t>.</w:t>
       </w:r>
-      <w:r>
-        <w:fldChar w:fldCharType="begin"/>
-      </w:r>
-      <w:r>
-        <w:instrText xml:space="preserve"> SEQ Hình_4. \* ARABIC </w:instrText>
-      </w:r>
-      <w:r>
-        <w:fldChar w:fldCharType="separate"/>
-      </w:r>
-      <w:r>
-        <w:rPr>
-          <w:noProof/>
-        </w:rPr>
-        <w:t>4</w:t>
-      </w:r>
-      <w:r>
-        <w:rPr>
-          <w:noProof/>
-        </w:rPr>
-        <w:fldChar w:fldCharType="end"/>
-      </w:r>
+      <w:fldSimple w:instr=" SEQ Hình_4. \* ARABIC ">
+        <w:r>
+          <w:rPr>
+            <w:noProof/>
+          </w:rPr>
+          <w:t>4</w:t>
+        </w:r>
+      </w:fldSimple>
       <w:r>
         <w:rPr>
           <w:lang w:val="vi-VN"/>
@@ -33238,27 +33133,14 @@
       <w:r>
         <w:t>.</w:t>
       </w:r>
-      <w:r>
-        <w:fldChar w:fldCharType="begin"/>
-      </w:r>
-      <w:r>
-        <w:instrText xml:space="preserve"> SEQ Hình_4. \* ARABIC </w:instrText>
-      </w:r>
-      <w:r>
-        <w:fldChar w:fldCharType="separate"/>
-      </w:r>
-      <w:r>
-        <w:rPr>
-          <w:noProof/>
-        </w:rPr>
-        <w:t>5</w:t>
-      </w:r>
-      <w:r>
-        <w:rPr>
-          <w:noProof/>
-        </w:rPr>
-        <w:fldChar w:fldCharType="end"/>
-      </w:r>
+      <w:fldSimple w:instr=" SEQ Hình_4. \* ARABIC ">
+        <w:r>
+          <w:rPr>
+            <w:noProof/>
+          </w:rPr>
+          <w:t>5</w:t>
+        </w:r>
+      </w:fldSimple>
       <w:r>
         <w:rPr>
           <w:lang w:val="vi-VN"/>
@@ -33482,27 +33364,14 @@
       <w:r>
         <w:t>.</w:t>
       </w:r>
-      <w:r>
-        <w:fldChar w:fldCharType="begin"/>
-      </w:r>
-      <w:r>
-        <w:instrText xml:space="preserve"> SEQ Hình_4. \* ARABIC </w:instrText>
-      </w:r>
-      <w:r>
-        <w:fldChar w:fldCharType="separate"/>
-      </w:r>
-      <w:r>
-        <w:rPr>
-          <w:noProof/>
-        </w:rPr>
-        <w:t>6</w:t>
-      </w:r>
-      <w:r>
-        <w:rPr>
-          <w:noProof/>
-        </w:rPr>
-        <w:fldChar w:fldCharType="end"/>
-      </w:r>
+      <w:fldSimple w:instr=" SEQ Hình_4. \* ARABIC ">
+        <w:r>
+          <w:rPr>
+            <w:noProof/>
+          </w:rPr>
+          <w:t>6</w:t>
+        </w:r>
+      </w:fldSimple>
       <w:r>
         <w:rPr>
           <w:lang w:val="vi-VN"/>
@@ -33617,27 +33486,14 @@
       <w:r>
         <w:t>.</w:t>
       </w:r>
-      <w:r>
-        <w:fldChar w:fldCharType="begin"/>
-      </w:r>
-      <w:r>
-        <w:instrText xml:space="preserve"> SEQ Hình_4. \* ARABIC </w:instrText>
-      </w:r>
-      <w:r>
-        <w:fldChar w:fldCharType="separate"/>
-      </w:r>
-      <w:r>
-        <w:rPr>
-          <w:noProof/>
-        </w:rPr>
-        <w:t>7</w:t>
-      </w:r>
-      <w:r>
-        <w:rPr>
-          <w:noProof/>
-        </w:rPr>
-        <w:fldChar w:fldCharType="end"/>
-      </w:r>
+      <w:fldSimple w:instr=" SEQ Hình_4. \* ARABIC ">
+        <w:r>
+          <w:rPr>
+            <w:noProof/>
+          </w:rPr>
+          <w:t>7</w:t>
+        </w:r>
+      </w:fldSimple>
       <w:r>
         <w:rPr>
           <w:lang w:val="vi-VN"/>
@@ -33757,27 +33613,14 @@
       <w:r>
         <w:t>.</w:t>
       </w:r>
-      <w:r>
-        <w:fldChar w:fldCharType="begin"/>
-      </w:r>
-      <w:r>
-        <w:instrText xml:space="preserve"> SEQ Hình_4. \* ARABIC </w:instrText>
-      </w:r>
-      <w:r>
-        <w:fldChar w:fldCharType="separate"/>
-      </w:r>
-      <w:r>
-        <w:rPr>
-          <w:noProof/>
-        </w:rPr>
-        <w:t>8</w:t>
-      </w:r>
-      <w:r>
-        <w:rPr>
-          <w:noProof/>
-        </w:rPr>
-        <w:fldChar w:fldCharType="end"/>
-      </w:r>
+      <w:fldSimple w:instr=" SEQ Hình_4. \* ARABIC ">
+        <w:r>
+          <w:rPr>
+            <w:noProof/>
+          </w:rPr>
+          <w:t>8</w:t>
+        </w:r>
+      </w:fldSimple>
       <w:r>
         <w:rPr>
           <w:lang w:val="vi-VN"/>
@@ -33924,27 +33767,14 @@
       <w:r>
         <w:t>.</w:t>
       </w:r>
-      <w:r>
-        <w:fldChar w:fldCharType="begin"/>
-      </w:r>
-      <w:r>
-        <w:instrText xml:space="preserve"> SEQ Hình_4. \* ARABIC </w:instrText>
-      </w:r>
-      <w:r>
-        <w:fldChar w:fldCharType="separate"/>
-      </w:r>
-      <w:r>
-        <w:rPr>
-          <w:noProof/>
-        </w:rPr>
-        <w:t>9</w:t>
-      </w:r>
-      <w:r>
-        <w:rPr>
-          <w:noProof/>
-        </w:rPr>
-        <w:fldChar w:fldCharType="end"/>
-      </w:r>
+      <w:fldSimple w:instr=" SEQ Hình_4. \* ARABIC ">
+        <w:r>
+          <w:rPr>
+            <w:noProof/>
+          </w:rPr>
+          <w:t>9</w:t>
+        </w:r>
+      </w:fldSimple>
       <w:r>
         <w:rPr>
           <w:lang w:val="vi-VN"/>
@@ -34071,27 +33901,14 @@
       <w:r>
         <w:t>.</w:t>
       </w:r>
-      <w:r>
-        <w:fldChar w:fldCharType="begin"/>
-      </w:r>
-      <w:r>
-        <w:instrText xml:space="preserve"> SEQ Hình_4. \* ARABIC </w:instrText>
-      </w:r>
-      <w:r>
-        <w:fldChar w:fldCharType="separate"/>
-      </w:r>
-      <w:r>
-        <w:rPr>
-          <w:noProof/>
-        </w:rPr>
-        <w:t>10</w:t>
-      </w:r>
-      <w:r>
-        <w:rPr>
-          <w:noProof/>
-        </w:rPr>
-        <w:fldChar w:fldCharType="end"/>
-      </w:r>
+      <w:fldSimple w:instr=" SEQ Hình_4. \* ARABIC ">
+        <w:r>
+          <w:rPr>
+            <w:noProof/>
+          </w:rPr>
+          <w:t>10</w:t>
+        </w:r>
+      </w:fldSimple>
       <w:r>
         <w:rPr>
           <w:lang w:val="vi-VN"/>
@@ -36039,27 +35856,14 @@
       <w:r>
         <w:t>.</w:t>
       </w:r>
-      <w:r>
-        <w:fldChar w:fldCharType="begin"/>
-      </w:r>
-      <w:r>
-        <w:instrText xml:space="preserve"> SEQ Bảng_5. \* ARABIC </w:instrText>
-      </w:r>
-      <w:r>
-        <w:fldChar w:fldCharType="separate"/>
-      </w:r>
-      <w:r>
-        <w:rPr>
-          <w:noProof/>
-        </w:rPr>
-        <w:t>1</w:t>
-      </w:r>
-      <w:r>
-        <w:rPr>
-          <w:noProof/>
-        </w:rPr>
-        <w:fldChar w:fldCharType="end"/>
-      </w:r>
+      <w:fldSimple w:instr=" SEQ Bảng_5. \* ARABIC ">
+        <w:r>
+          <w:rPr>
+            <w:noProof/>
+          </w:rPr>
+          <w:t>1</w:t>
+        </w:r>
+      </w:fldSimple>
       <w:r>
         <w:rPr>
           <w:lang w:val="vi-VN"/>
@@ -36430,27 +36234,14 @@
       <w:r>
         <w:t>.</w:t>
       </w:r>
-      <w:r>
-        <w:fldChar w:fldCharType="begin"/>
-      </w:r>
-      <w:r>
-        <w:instrText xml:space="preserve"> SEQ Bảng_5. \* ARABIC </w:instrText>
-      </w:r>
-      <w:r>
-        <w:fldChar w:fldCharType="separate"/>
-      </w:r>
-      <w:r>
-        <w:rPr>
-          <w:noProof/>
-        </w:rPr>
-        <w:t>2</w:t>
-      </w:r>
-      <w:r>
-        <w:rPr>
-          <w:noProof/>
-        </w:rPr>
-        <w:fldChar w:fldCharType="end"/>
-      </w:r>
+      <w:fldSimple w:instr=" SEQ Bảng_5. \* ARABIC ">
+        <w:r>
+          <w:rPr>
+            <w:noProof/>
+          </w:rPr>
+          <w:t>2</w:t>
+        </w:r>
+      </w:fldSimple>
       <w:r>
         <w:rPr>
           <w:lang w:val="vi-VN"/>
@@ -37476,27 +37267,14 @@
       <w:r>
         <w:t>.</w:t>
       </w:r>
-      <w:r>
-        <w:fldChar w:fldCharType="begin"/>
-      </w:r>
-      <w:r>
-        <w:instrText xml:space="preserve"> SEQ Hình_5. \* ARABIC </w:instrText>
-      </w:r>
-      <w:r>
-        <w:fldChar w:fldCharType="separate"/>
-      </w:r>
-      <w:r>
-        <w:rPr>
-          <w:noProof/>
-        </w:rPr>
-        <w:t>1</w:t>
-      </w:r>
-      <w:r>
-        <w:rPr>
-          <w:noProof/>
-        </w:rPr>
-        <w:fldChar w:fldCharType="end"/>
-      </w:r>
+      <w:fldSimple w:instr=" SEQ Hình_5. \* ARABIC ">
+        <w:r>
+          <w:rPr>
+            <w:noProof/>
+          </w:rPr>
+          <w:t>1</w:t>
+        </w:r>
+      </w:fldSimple>
       <w:r>
         <w:rPr>
           <w:lang w:val="vi-VN"/>
@@ -37632,27 +37410,14 @@
       <w:r>
         <w:t>.</w:t>
       </w:r>
-      <w:r>
-        <w:fldChar w:fldCharType="begin"/>
-      </w:r>
-      <w:r>
-        <w:instrText xml:space="preserve"> SEQ Hình_6. \* ARABIC </w:instrText>
-      </w:r>
-      <w:r>
-        <w:fldChar w:fldCharType="separate"/>
-      </w:r>
-      <w:r>
-        <w:rPr>
-          <w:noProof/>
-        </w:rPr>
-        <w:t>1</w:t>
-      </w:r>
-      <w:r>
-        <w:rPr>
-          <w:noProof/>
-        </w:rPr>
-        <w:fldChar w:fldCharType="end"/>
-      </w:r>
+      <w:fldSimple w:instr=" SEQ Hình_6. \* ARABIC ">
+        <w:r>
+          <w:rPr>
+            <w:noProof/>
+          </w:rPr>
+          <w:t>1</w:t>
+        </w:r>
+      </w:fldSimple>
       <w:r>
         <w:rPr>
           <w:lang w:val="vi-VN"/>
@@ -37726,27 +37491,14 @@
       <w:r>
         <w:t>.</w:t>
       </w:r>
-      <w:r>
-        <w:fldChar w:fldCharType="begin"/>
-      </w:r>
-      <w:r>
-        <w:instrText xml:space="preserve"> SEQ Hình_6. \* ARABIC </w:instrText>
-      </w:r>
-      <w:r>
-        <w:fldChar w:fldCharType="separate"/>
-      </w:r>
-      <w:r>
-        <w:rPr>
-          <w:noProof/>
-        </w:rPr>
-        <w:t>2</w:t>
-      </w:r>
-      <w:r>
-        <w:rPr>
-          <w:noProof/>
-        </w:rPr>
-        <w:fldChar w:fldCharType="end"/>
-      </w:r>
+      <w:fldSimple w:instr=" SEQ Hình_6. \* ARABIC ">
+        <w:r>
+          <w:rPr>
+            <w:noProof/>
+          </w:rPr>
+          <w:t>2</w:t>
+        </w:r>
+      </w:fldSimple>
       <w:r>
         <w:rPr>
           <w:lang w:val="vi-VN"/>
@@ -37851,27 +37603,14 @@
       <w:r>
         <w:t>.</w:t>
       </w:r>
-      <w:r>
-        <w:fldChar w:fldCharType="begin"/>
-      </w:r>
-      <w:r>
-        <w:instrText xml:space="preserve"> SEQ Hình_6. \* ARABIC </w:instrText>
-      </w:r>
-      <w:r>
-        <w:fldChar w:fldCharType="separate"/>
-      </w:r>
-      <w:r>
-        <w:rPr>
-          <w:noProof/>
-        </w:rPr>
-        <w:t>3</w:t>
-      </w:r>
-      <w:r>
-        <w:rPr>
-          <w:noProof/>
-        </w:rPr>
-        <w:fldChar w:fldCharType="end"/>
-      </w:r>
+      <w:fldSimple w:instr=" SEQ Hình_6. \* ARABIC ">
+        <w:r>
+          <w:rPr>
+            <w:noProof/>
+          </w:rPr>
+          <w:t>3</w:t>
+        </w:r>
+      </w:fldSimple>
       <w:r>
         <w:rPr>
           <w:lang w:val="vi-VN"/>
@@ -37976,27 +37715,14 @@
       <w:r>
         <w:t>.</w:t>
       </w:r>
-      <w:r>
-        <w:fldChar w:fldCharType="begin"/>
-      </w:r>
-      <w:r>
-        <w:instrText xml:space="preserve"> SEQ Hình_6. \* ARABIC </w:instrText>
-      </w:r>
-      <w:r>
-        <w:fldChar w:fldCharType="separate"/>
-      </w:r>
-      <w:r>
-        <w:rPr>
-          <w:noProof/>
-        </w:rPr>
-        <w:t>4</w:t>
-      </w:r>
-      <w:r>
-        <w:rPr>
-          <w:noProof/>
-        </w:rPr>
-        <w:fldChar w:fldCharType="end"/>
-      </w:r>
+      <w:fldSimple w:instr=" SEQ Hình_6. \* ARABIC ">
+        <w:r>
+          <w:rPr>
+            <w:noProof/>
+          </w:rPr>
+          <w:t>4</w:t>
+        </w:r>
+      </w:fldSimple>
       <w:r>
         <w:rPr>
           <w:lang w:val="vi-VN"/>
@@ -38117,27 +37843,14 @@
       <w:r>
         <w:t>.</w:t>
       </w:r>
-      <w:r>
-        <w:fldChar w:fldCharType="begin"/>
-      </w:r>
-      <w:r>
-        <w:instrText xml:space="preserve"> SEQ Hình_6. \* ARABIC </w:instrText>
-      </w:r>
-      <w:r>
-        <w:fldChar w:fldCharType="separate"/>
-      </w:r>
-      <w:r>
-        <w:rPr>
-          <w:noProof/>
-        </w:rPr>
-        <w:t>5</w:t>
-      </w:r>
-      <w:r>
-        <w:rPr>
-          <w:noProof/>
-        </w:rPr>
-        <w:fldChar w:fldCharType="end"/>
-      </w:r>
+      <w:fldSimple w:instr=" SEQ Hình_6. \* ARABIC ">
+        <w:r>
+          <w:rPr>
+            <w:noProof/>
+          </w:rPr>
+          <w:t>5</w:t>
+        </w:r>
+      </w:fldSimple>
       <w:r>
         <w:rPr>
           <w:lang w:val="vi-VN"/>
@@ -38265,27 +37978,14 @@
       <w:r>
         <w:t>.</w:t>
       </w:r>
-      <w:r>
-        <w:fldChar w:fldCharType="begin"/>
-      </w:r>
-      <w:r>
-        <w:instrText xml:space="preserve"> SEQ Hình_6. \* ARABIC </w:instrText>
-      </w:r>
-      <w:r>
-        <w:fldChar w:fldCharType="separate"/>
-      </w:r>
-      <w:r>
-        <w:rPr>
-          <w:noProof/>
-        </w:rPr>
-        <w:t>6</w:t>
-      </w:r>
-      <w:r>
-        <w:rPr>
-          <w:noProof/>
-        </w:rPr>
-        <w:fldChar w:fldCharType="end"/>
-      </w:r>
+      <w:fldSimple w:instr=" SEQ Hình_6. \* ARABIC ">
+        <w:r>
+          <w:rPr>
+            <w:noProof/>
+          </w:rPr>
+          <w:t>6</w:t>
+        </w:r>
+      </w:fldSimple>
       <w:r>
         <w:rPr>
           <w:lang w:val="vi-VN"/>
@@ -38394,27 +38094,14 @@
       <w:r>
         <w:t>.</w:t>
       </w:r>
-      <w:r>
-        <w:fldChar w:fldCharType="begin"/>
-      </w:r>
-      <w:r>
-        <w:instrText xml:space="preserve"> SEQ Hình_6. \* ARABIC </w:instrText>
-      </w:r>
-      <w:r>
-        <w:fldChar w:fldCharType="separate"/>
-      </w:r>
-      <w:r>
-        <w:rPr>
-          <w:noProof/>
-        </w:rPr>
-        <w:t>7</w:t>
-      </w:r>
-      <w:r>
-        <w:rPr>
-          <w:noProof/>
-        </w:rPr>
-        <w:fldChar w:fldCharType="end"/>
-      </w:r>
+      <w:fldSimple w:instr=" SEQ Hình_6. \* ARABIC ">
+        <w:r>
+          <w:rPr>
+            <w:noProof/>
+          </w:rPr>
+          <w:t>7</w:t>
+        </w:r>
+      </w:fldSimple>
       <w:r>
         <w:rPr>
           <w:lang w:val="vi-VN"/>
@@ -38517,27 +38204,14 @@
       <w:r>
         <w:t>.</w:t>
       </w:r>
-      <w:r>
-        <w:fldChar w:fldCharType="begin"/>
-      </w:r>
-      <w:r>
-        <w:instrText xml:space="preserve"> SEQ Hình_6. \* ARABIC </w:instrText>
-      </w:r>
-      <w:r>
-        <w:fldChar w:fldCharType="separate"/>
-      </w:r>
-      <w:r>
-        <w:rPr>
-          <w:noProof/>
-        </w:rPr>
-        <w:t>8</w:t>
-      </w:r>
-      <w:r>
-        <w:rPr>
-          <w:noProof/>
-        </w:rPr>
-        <w:fldChar w:fldCharType="end"/>
-      </w:r>
+      <w:fldSimple w:instr=" SEQ Hình_6. \* ARABIC ">
+        <w:r>
+          <w:rPr>
+            <w:noProof/>
+          </w:rPr>
+          <w:t>8</w:t>
+        </w:r>
+      </w:fldSimple>
       <w:r>
         <w:rPr>
           <w:lang w:val="vi-VN"/>
@@ -38633,27 +38307,14 @@
       <w:r>
         <w:t>.</w:t>
       </w:r>
-      <w:r>
-        <w:fldChar w:fldCharType="begin"/>
-      </w:r>
-      <w:r>
-        <w:instrText xml:space="preserve"> SEQ Hình_6. \* ARABIC </w:instrText>
-      </w:r>
-      <w:r>
-        <w:fldChar w:fldCharType="separate"/>
-      </w:r>
-      <w:r>
-        <w:rPr>
-          <w:noProof/>
-        </w:rPr>
-        <w:t>9</w:t>
-      </w:r>
-      <w:r>
-        <w:rPr>
-          <w:noProof/>
-        </w:rPr>
-        <w:fldChar w:fldCharType="end"/>
-      </w:r>
+      <w:fldSimple w:instr=" SEQ Hình_6. \* ARABIC ">
+        <w:r>
+          <w:rPr>
+            <w:noProof/>
+          </w:rPr>
+          <w:t>9</w:t>
+        </w:r>
+      </w:fldSimple>
       <w:r>
         <w:rPr>
           <w:lang w:val="vi-VN"/>
@@ -38781,27 +38442,14 @@
       <w:r>
         <w:t>.</w:t>
       </w:r>
-      <w:r>
-        <w:fldChar w:fldCharType="begin"/>
-      </w:r>
-      <w:r>
-        <w:instrText xml:space="preserve"> SEQ Hình_6. \* ARABIC </w:instrText>
-      </w:r>
-      <w:r>
-        <w:fldChar w:fldCharType="separate"/>
-      </w:r>
-      <w:r>
-        <w:rPr>
-          <w:noProof/>
-        </w:rPr>
-        <w:t>10</w:t>
-      </w:r>
-      <w:r>
-        <w:rPr>
-          <w:noProof/>
-        </w:rPr>
-        <w:fldChar w:fldCharType="end"/>
-      </w:r>
+      <w:fldSimple w:instr=" SEQ Hình_6. \* ARABIC ">
+        <w:r>
+          <w:rPr>
+            <w:noProof/>
+          </w:rPr>
+          <w:t>10</w:t>
+        </w:r>
+      </w:fldSimple>
       <w:r>
         <w:rPr>
           <w:lang w:val="vi-VN"/>
@@ -38880,27 +38528,14 @@
       <w:r>
         <w:t>.</w:t>
       </w:r>
-      <w:r>
-        <w:fldChar w:fldCharType="begin"/>
-      </w:r>
-      <w:r>
-        <w:instrText xml:space="preserve"> SEQ Hình_6. \* ARABIC </w:instrText>
-      </w:r>
-      <w:r>
-        <w:fldChar w:fldCharType="separate"/>
-      </w:r>
-      <w:r>
-        <w:rPr>
-          <w:noProof/>
-        </w:rPr>
-        <w:t>11</w:t>
-      </w:r>
-      <w:r>
-        <w:rPr>
-          <w:noProof/>
-        </w:rPr>
-        <w:fldChar w:fldCharType="end"/>
-      </w:r>
+      <w:fldSimple w:instr=" SEQ Hình_6. \* ARABIC ">
+        <w:r>
+          <w:rPr>
+            <w:noProof/>
+          </w:rPr>
+          <w:t>11</w:t>
+        </w:r>
+      </w:fldSimple>
       <w:r>
         <w:rPr>
           <w:lang w:val="vi-VN"/>
@@ -38976,27 +38611,14 @@
       <w:r>
         <w:t>.</w:t>
       </w:r>
-      <w:r>
-        <w:fldChar w:fldCharType="begin"/>
-      </w:r>
-      <w:r>
-        <w:instrText xml:space="preserve"> SEQ Hình_6. \* ARABIC </w:instrText>
-      </w:r>
-      <w:r>
-        <w:fldChar w:fldCharType="separate"/>
-      </w:r>
-      <w:r>
-        <w:rPr>
-          <w:noProof/>
-        </w:rPr>
-        <w:t>12</w:t>
-      </w:r>
-      <w:r>
-        <w:rPr>
-          <w:noProof/>
-        </w:rPr>
-        <w:fldChar w:fldCharType="end"/>
-      </w:r>
+      <w:fldSimple w:instr=" SEQ Hình_6. \* ARABIC ">
+        <w:r>
+          <w:rPr>
+            <w:noProof/>
+          </w:rPr>
+          <w:t>12</w:t>
+        </w:r>
+      </w:fldSimple>
       <w:r>
         <w:rPr>
           <w:lang w:val="vi-VN"/>
@@ -39076,27 +38698,14 @@
       <w:r>
         <w:t>.</w:t>
       </w:r>
-      <w:r>
-        <w:fldChar w:fldCharType="begin"/>
-      </w:r>
-      <w:r>
-        <w:instrText xml:space="preserve"> SEQ Hình_6. \* ARABIC </w:instrText>
-      </w:r>
-      <w:r>
-        <w:fldChar w:fldCharType="separate"/>
-      </w:r>
-      <w:r>
-        <w:rPr>
-          <w:noProof/>
-        </w:rPr>
-        <w:t>13</w:t>
-      </w:r>
-      <w:r>
-        <w:rPr>
-          <w:noProof/>
-        </w:rPr>
-        <w:fldChar w:fldCharType="end"/>
-      </w:r>
+      <w:fldSimple w:instr=" SEQ Hình_6. \* ARABIC ">
+        <w:r>
+          <w:rPr>
+            <w:noProof/>
+          </w:rPr>
+          <w:t>13</w:t>
+        </w:r>
+      </w:fldSimple>
       <w:r>
         <w:rPr>
           <w:lang w:val="vi-VN"/>
@@ -39433,32 +39042,22 @@
       <w:pPr>
         <w:pStyle w:val="Caption"/>
       </w:pPr>
-      <w:bookmarkStart w:id="178" w:name="_Toc225015307"/>
-      <w:bookmarkStart w:id="179" w:name="_Toc225018707"/>
-      <w:bookmarkStart w:id="180" w:name="_Toc225019347"/>
-      <w:bookmarkStart w:id="181" w:name="_Toc226069644"/>
-      <w:bookmarkStart w:id="182" w:name="_Toc226069781"/>
+      <w:bookmarkStart w:id="178" w:name="_Toc226069644"/>
+      <w:bookmarkStart w:id="179" w:name="_Toc226069781"/>
+      <w:bookmarkStart w:id="180" w:name="_Toc225015307"/>
+      <w:bookmarkStart w:id="181" w:name="_Toc225018707"/>
+      <w:bookmarkStart w:id="182" w:name="_Toc225019347"/>
       <w:r>
         <w:t>Bảng 7.</w:t>
       </w:r>
-      <w:r>
-        <w:fldChar w:fldCharType="begin"/>
-      </w:r>
-      <w:r>
-        <w:instrText xml:space="preserve"> SEQ Bảng_7. \* ARABIC </w:instrText>
-      </w:r>
-      <w:r>
-        <w:fldChar w:fldCharType="separate"/>
-      </w:r>
-      <w:r>
-        <w:rPr>
-          <w:noProof/>
-        </w:rPr>
-        <w:t>1</w:t>
-      </w:r>
-      <w:r>
-        <w:fldChar w:fldCharType="end"/>
-      </w:r>
+      <w:fldSimple w:instr=" SEQ Bảng_7. \* ARABIC ">
+        <w:r>
+          <w:rPr>
+            <w:noProof/>
+          </w:rPr>
+          <w:t>1</w:t>
+        </w:r>
+      </w:fldSimple>
       <w:r>
         <w:rPr>
           <w:lang w:val="vi-VN"/>
@@ -39471,12 +39070,12 @@
         </w:rPr>
         <w:t>Bảng cấu hình phần cứng</w:t>
       </w:r>
-      <w:bookmarkEnd w:id="181"/>
-      <w:bookmarkEnd w:id="182"/>
-    </w:p>
-    <w:bookmarkEnd w:id="178"/>
-    <w:bookmarkEnd w:id="179"/>
+      <w:bookmarkEnd w:id="178"/>
+      <w:bookmarkEnd w:id="179"/>
+    </w:p>
     <w:bookmarkEnd w:id="180"/>
+    <w:bookmarkEnd w:id="181"/>
+    <w:bookmarkEnd w:id="182"/>
     <w:p>
       <w:pPr>
         <w:pStyle w:val="Heading3"/>
@@ -40525,31 +40124,21 @@
       <w:pPr>
         <w:pStyle w:val="Caption"/>
       </w:pPr>
-      <w:bookmarkStart w:id="187" w:name="_Toc225018708"/>
-      <w:bookmarkStart w:id="188" w:name="_Toc225019348"/>
-      <w:bookmarkStart w:id="189" w:name="_Toc226069645"/>
-      <w:bookmarkStart w:id="190" w:name="_Toc226069782"/>
+      <w:bookmarkStart w:id="187" w:name="_Toc226069645"/>
+      <w:bookmarkStart w:id="188" w:name="_Toc226069782"/>
+      <w:bookmarkStart w:id="189" w:name="_Toc225018708"/>
+      <w:bookmarkStart w:id="190" w:name="_Toc225019348"/>
       <w:r>
         <w:t>Bảng 7.</w:t>
       </w:r>
-      <w:r>
-        <w:fldChar w:fldCharType="begin"/>
-      </w:r>
-      <w:r>
-        <w:instrText xml:space="preserve"> SEQ Bảng_7. \* ARABIC </w:instrText>
-      </w:r>
-      <w:r>
-        <w:fldChar w:fldCharType="separate"/>
-      </w:r>
-      <w:r>
-        <w:rPr>
-          <w:noProof/>
-        </w:rPr>
-        <w:t>2</w:t>
-      </w:r>
-      <w:r>
-        <w:fldChar w:fldCharType="end"/>
-      </w:r>
+      <w:fldSimple w:instr=" SEQ Bảng_7. \* ARABIC ">
+        <w:r>
+          <w:rPr>
+            <w:noProof/>
+          </w:rPr>
+          <w:t>2</w:t>
+        </w:r>
+      </w:fldSimple>
       <w:r>
         <w:rPr>
           <w:lang w:val="vi-VN"/>
@@ -40562,11 +40151,11 @@
         </w:rPr>
         <w:t>Bảng tốc độ phản hồi</w:t>
       </w:r>
-      <w:bookmarkEnd w:id="189"/>
-      <w:bookmarkEnd w:id="190"/>
-    </w:p>
-    <w:bookmarkEnd w:id="187"/>
-    <w:bookmarkEnd w:id="188"/>
+      <w:bookmarkEnd w:id="187"/>
+      <w:bookmarkEnd w:id="188"/>
+    </w:p>
+    <w:bookmarkEnd w:id="189"/>
+    <w:bookmarkEnd w:id="190"/>
     <w:p>
       <w:pPr>
         <w:jc w:val="both"/>
@@ -41080,24 +40669,14 @@
       <w:r>
         <w:t>Bảng 7.</w:t>
       </w:r>
-      <w:r>
-        <w:fldChar w:fldCharType="begin"/>
-      </w:r>
-      <w:r>
-        <w:instrText xml:space="preserve"> SEQ Bảng_7. \* ARABIC </w:instrText>
-      </w:r>
-      <w:r>
-        <w:fldChar w:fldCharType="separate"/>
-      </w:r>
-      <w:r>
-        <w:rPr>
-          <w:noProof/>
-        </w:rPr>
-        <w:t>3</w:t>
-      </w:r>
-      <w:r>
-        <w:fldChar w:fldCharType="end"/>
-      </w:r>
+      <w:fldSimple w:instr=" SEQ Bảng_7. \* ARABIC ">
+        <w:r>
+          <w:rPr>
+            <w:noProof/>
+          </w:rPr>
+          <w:t>3</w:t>
+        </w:r>
+      </w:fldSimple>
       <w:r>
         <w:rPr>
           <w:lang w:val="vi-VN"/>
@@ -41625,24 +41204,14 @@
       <w:r>
         <w:t>Bảng 7.</w:t>
       </w:r>
-      <w:r>
-        <w:fldChar w:fldCharType="begin"/>
-      </w:r>
-      <w:r>
-        <w:instrText xml:space="preserve"> SEQ Bảng_7. \* ARABIC </w:instrText>
-      </w:r>
-      <w:r>
-        <w:fldChar w:fldCharType="separate"/>
-      </w:r>
-      <w:r>
-        <w:rPr>
-          <w:noProof/>
-        </w:rPr>
-        <w:t>4</w:t>
-      </w:r>
-      <w:r>
-        <w:fldChar w:fldCharType="end"/>
-      </w:r>
+      <w:fldSimple w:instr=" SEQ Bảng_7. \* ARABIC ">
+        <w:r>
+          <w:rPr>
+            <w:noProof/>
+          </w:rPr>
+          <w:t>4</w:t>
+        </w:r>
+      </w:fldSimple>
       <w:r>
         <w:rPr>
           <w:lang w:val="vi-VN"/>
@@ -41940,6 +41509,9 @@
       </w:r>
       <w:bookmarkStart w:id="200" w:name="_Toc226070668"/>
       <w:r>
+        <w:rPr>
+          <w:lang w:val="vi-VN"/>
+        </w:rPr>
         <w:t>7.4.1 Thiết lập Benchmark</w:t>
       </w:r>
       <w:bookmarkEnd w:id="200"/>
@@ -42271,24 +41843,14 @@
       <w:r>
         <w:t>Bảng 7.</w:t>
       </w:r>
-      <w:r>
-        <w:fldChar w:fldCharType="begin"/>
-      </w:r>
-      <w:r>
-        <w:instrText xml:space="preserve"> SEQ Bảng_7. \* ARABIC </w:instrText>
-      </w:r>
-      <w:r>
-        <w:fldChar w:fldCharType="separate"/>
-      </w:r>
-      <w:r>
-        <w:rPr>
-          <w:noProof/>
-        </w:rPr>
-        <w:t>5</w:t>
-      </w:r>
-      <w:r>
-        <w:fldChar w:fldCharType="end"/>
-      </w:r>
+      <w:fldSimple w:instr=" SEQ Bảng_7. \* ARABIC ">
+        <w:r>
+          <w:rPr>
+            <w:noProof/>
+          </w:rPr>
+          <w:t>5</w:t>
+        </w:r>
+      </w:fldSimple>
       <w:r>
         <w:rPr>
           <w:lang w:val="vi-VN"/>
@@ -43063,24 +42625,14 @@
       <w:r>
         <w:t>Bảng 7.</w:t>
       </w:r>
-      <w:r>
-        <w:fldChar w:fldCharType="begin"/>
-      </w:r>
-      <w:r>
-        <w:instrText xml:space="preserve"> SEQ Bảng_7. \* ARABIC </w:instrText>
-      </w:r>
-      <w:r>
-        <w:fldChar w:fldCharType="separate"/>
-      </w:r>
-      <w:r>
-        <w:rPr>
-          <w:noProof/>
-        </w:rPr>
-        <w:t>6</w:t>
-      </w:r>
-      <w:r>
-        <w:fldChar w:fldCharType="end"/>
-      </w:r>
+      <w:fldSimple w:instr=" SEQ Bảng_7. \* ARABIC ">
+        <w:r>
+          <w:rPr>
+            <w:noProof/>
+          </w:rPr>
+          <w:t>6</w:t>
+        </w:r>
+      </w:fldSimple>
       <w:r>
         <w:rPr>
           <w:lang w:val="vi-VN"/>
@@ -43578,24 +43130,14 @@
       <w:r>
         <w:t>Bảng 7.</w:t>
       </w:r>
-      <w:r>
-        <w:fldChar w:fldCharType="begin"/>
-      </w:r>
-      <w:r>
-        <w:instrText xml:space="preserve"> SEQ Bảng_7. \* ARABIC </w:instrText>
-      </w:r>
-      <w:r>
-        <w:fldChar w:fldCharType="separate"/>
-      </w:r>
-      <w:r>
-        <w:rPr>
-          <w:noProof/>
-        </w:rPr>
-        <w:t>7</w:t>
-      </w:r>
-      <w:r>
-        <w:fldChar w:fldCharType="end"/>
-      </w:r>
+      <w:fldSimple w:instr=" SEQ Bảng_7. \* ARABIC ">
+        <w:r>
+          <w:rPr>
+            <w:noProof/>
+          </w:rPr>
+          <w:t>7</w:t>
+        </w:r>
+      </w:fldSimple>
       <w:r>
         <w:rPr>
           <w:lang w:val="vi-VN"/>
@@ -43809,24 +43351,14 @@
       <w:r>
         <w:t>Bảng 7.</w:t>
       </w:r>
-      <w:r>
-        <w:fldChar w:fldCharType="begin"/>
-      </w:r>
-      <w:r>
-        <w:instrText xml:space="preserve"> SEQ Bảng_7. \* ARABIC </w:instrText>
-      </w:r>
-      <w:r>
-        <w:fldChar w:fldCharType="separate"/>
-      </w:r>
-      <w:r>
-        <w:rPr>
-          <w:noProof/>
-        </w:rPr>
-        <w:t>8</w:t>
-      </w:r>
-      <w:r>
-        <w:fldChar w:fldCharType="end"/>
-      </w:r>
+      <w:fldSimple w:instr=" SEQ Bảng_7. \* ARABIC ">
+        <w:r>
+          <w:rPr>
+            <w:noProof/>
+          </w:rPr>
+          <w:t>8</w:t>
+        </w:r>
+      </w:fldSimple>
       <w:r>
         <w:rPr>
           <w:lang w:val="vi-VN"/>
@@ -43913,24 +43445,14 @@
       <w:r>
         <w:t>Hình 7.</w:t>
       </w:r>
-      <w:r>
-        <w:fldChar w:fldCharType="begin"/>
-      </w:r>
-      <w:r>
-        <w:instrText xml:space="preserve"> SEQ Hình_7. \* ARABIC </w:instrText>
-      </w:r>
-      <w:r>
-        <w:fldChar w:fldCharType="separate"/>
-      </w:r>
-      <w:r>
-        <w:rPr>
-          <w:noProof/>
-        </w:rPr>
-        <w:t>1</w:t>
-      </w:r>
-      <w:r>
-        <w:fldChar w:fldCharType="end"/>
-      </w:r>
+      <w:fldSimple w:instr=" SEQ Hình_7. \* ARABIC ">
+        <w:r>
+          <w:rPr>
+            <w:noProof/>
+          </w:rPr>
+          <w:t>1</w:t>
+        </w:r>
+      </w:fldSimple>
       <w:r>
         <w:rPr>
           <w:lang w:val="vi-VN"/>
@@ -44338,24 +43860,14 @@
       <w:r>
         <w:t>Bảng 7.</w:t>
       </w:r>
-      <w:r>
-        <w:fldChar w:fldCharType="begin"/>
-      </w:r>
-      <w:r>
-        <w:instrText xml:space="preserve"> SEQ Bảng_7. \* ARABIC </w:instrText>
-      </w:r>
-      <w:r>
-        <w:fldChar w:fldCharType="separate"/>
-      </w:r>
-      <w:r>
-        <w:rPr>
-          <w:noProof/>
-        </w:rPr>
-        <w:t>9</w:t>
-      </w:r>
-      <w:r>
-        <w:fldChar w:fldCharType="end"/>
-      </w:r>
+      <w:fldSimple w:instr=" SEQ Bảng_7. \* ARABIC ">
+        <w:r>
+          <w:rPr>
+            <w:noProof/>
+          </w:rPr>
+          <w:t>9</w:t>
+        </w:r>
+      </w:fldSimple>
       <w:r>
         <w:rPr>
           <w:lang w:val="vi-VN"/>
@@ -44367,6 +43879,9 @@
     <w:p>
       <w:pPr>
         <w:jc w:val="both"/>
+        <w:rPr>
+          <w:lang w:val="vi-VN"/>
+        </w:rPr>
       </w:pPr>
       <w:r>
         <w:rPr>
@@ -44405,6 +43920,9 @@
         <w:t xml:space="preserve"> là bằng chứng mạnh mẽ cho thấy kiến trúc 3 pha EDC (Extract – Define – Canonicalize) hoạt động hiệu quả trên bài toán Trích xuất Tri thức từ văn bản phi cấu trúc. </w:t>
       </w:r>
       <w:r>
+        <w:rPr>
+          <w:lang w:val="vi-VN"/>
+        </w:rPr>
         <w:t>Vấn đề Spurious (trích xuất thừa) chiếm tỷ lệ lớn nhất trong lỗi, một phần vì Llama 3.3 có xu hướng cẩn thận sinh ra nhiều Triple hơn cần thiết — đây là hành vi chấp nhận được và có thể kiểm soát bằng cách điều chỉnh ngưỡng Cosine Similarity hoặc thêm constraint vào few-shot prompt.</w:t>
       </w:r>
     </w:p>
@@ -60814,6 +60332,7 @@
   <w:style w:type="character" w:default="1" w:styleId="DefaultParagraphFont">
     <w:name w:val="Default Paragraph Font"/>
     <w:uiPriority w:val="1"/>
+    <w:semiHidden/>
     <w:unhideWhenUsed/>
   </w:style>
   <w:style w:type="table" w:default="1" w:styleId="TableNormal">

</xml_diff>